<commit_message>
fix: Termo de Responsabilidade — mãe em cima, cliente abaixo, data por extenso
- Tabela substituída de loop de beneficiários para dois blocos fixos:
  1. Responsável (Representante): {representante_nome} + {representante_cpf}
  2. Beneficiário representado: {cliente.nome_completo} + {cliente.cpf}
- Data no formato extenso (17 de maio de 2026) igual aos demais documentos
- Linha de assinatura com nome em negrito, sem label "Assinatura:"
- Tutor Nato sempre X mantido (já existente)

Co-Authored-By: Claude Sonnet 4.6 <noreply@anthropic.com>
</commit_message>
<xml_diff>
--- a/templates/15_termo_responsabilidade.docx
+++ b/templates/15_termo_responsabilidade.docx
@@ -202,7 +202,7 @@
                 <w:sz w:val="22"/>
                 <w:szCs w:val="22"/>
               </w:rPr>
-              <w:t xml:space="preserve">Beneficiários:</w:t>
+              <w:t xml:space="preserve">Responsável (Representante):</w:t>
             </w:r>
           </w:p>
         </w:tc>
@@ -229,15 +229,15 @@
                 <w:sz w:val="22"/>
                 <w:szCs w:val="22"/>
               </w:rPr>
-              <w:t xml:space="preserve">{#representacao_legal.beneficiarios_representados}Nome: </w:t>
-            </w:r>
-            <w:r>
-              <w:rPr>
-                <w:rFonts w:ascii="Arial" w:cs="Arial" w:eastAsia="Arial" w:hAnsi="Arial"/>
-                <w:sz w:val="22"/>
-                <w:szCs w:val="22"/>
-              </w:rPr>
-              <w:t xml:space="preserve">{.nome}</w:t>
+              <w:t xml:space="preserve">Nome: </w:t>
+            </w:r>
+            <w:r>
+              <w:rPr>
+                <w:rFonts w:ascii="Arial" w:cs="Arial" w:eastAsia="Arial" w:hAnsi="Arial"/>
+                <w:sz w:val="22"/>
+                <w:szCs w:val="22"/>
+              </w:rPr>
+              <w:t xml:space="preserve">{representacao_legal.representante_nome}</w:t>
             </w:r>
           </w:p>
         </w:tc>
@@ -262,15 +262,112 @@
                 <w:sz w:val="22"/>
                 <w:szCs w:val="22"/>
               </w:rPr>
-              <w:t xml:space="preserve">CPF: {.cpf}</w:t>
-            </w:r>
-            <w:r>
-              <w:rPr>
-                <w:rFonts w:ascii="Arial" w:cs="Arial" w:eastAsia="Arial" w:hAnsi="Arial"/>
-                <w:sz w:val="22"/>
-                <w:szCs w:val="22"/>
-              </w:rPr>
-              <w:t xml:space="preserve">{/representacao_legal.beneficiarios_representados}</w:t>
+              <w:t xml:space="preserve">CPF: </w:t>
+            </w:r>
+            <w:r>
+              <w:rPr>
+                <w:rFonts w:ascii="Arial" w:cs="Arial" w:eastAsia="Arial" w:hAnsi="Arial"/>
+                <w:sz w:val="22"/>
+                <w:szCs w:val="22"/>
+              </w:rPr>
+              <w:t xml:space="preserve">{representacao_legal.representante_cpf}</w:t>
+            </w:r>
+          </w:p>
+        </w:tc>
+      </w:tr>
+      <w:tr>
+        <w:tc>
+          <w:tcPr>
+            <w:gridSpan w:val="2"/>
+            <w:tcBorders>
+              <w:top w:val="single" w:color="000000" w:sz="4"/>
+              <w:left w:val="single" w:color="000000" w:sz="4"/>
+              <w:bottom w:val="single" w:color="000000" w:sz="4"/>
+              <w:right w:val="single" w:color="000000" w:sz="4"/>
+            </w:tcBorders>
+          </w:tcPr>
+          <w:p>
+            <w:pPr>
+              <w:spacing w:after="40" w:before="40" w:line="276" w:lineRule="auto"/>
+              <w:jc w:val="center"/>
+            </w:pPr>
+            <w:r>
+              <w:rPr>
+                <w:rFonts w:ascii="Arial" w:cs="Arial" w:eastAsia="Arial" w:hAnsi="Arial"/>
+                <w:b/>
+                <w:bCs/>
+                <w:sz w:val="22"/>
+                <w:szCs w:val="22"/>
+              </w:rPr>
+              <w:t xml:space="preserve">Beneficiário representado:</w:t>
+            </w:r>
+          </w:p>
+        </w:tc>
+      </w:tr>
+      <w:tr>
+        <w:tc>
+          <w:tcPr>
+            <w:tcW w:type="dxa" w:w="6800"/>
+            <w:tcBorders>
+              <w:top w:val="single" w:color="000000" w:sz="4"/>
+              <w:left w:val="single" w:color="000000" w:sz="4"/>
+              <w:bottom w:val="single" w:color="000000" w:sz="4"/>
+              <w:right w:val="single" w:color="000000" w:sz="4"/>
+            </w:tcBorders>
+          </w:tcPr>
+          <w:p>
+            <w:pPr>
+              <w:spacing w:after="40" w:before="40" w:line="276" w:lineRule="auto"/>
+              <w:jc w:val="left"/>
+            </w:pPr>
+            <w:r>
+              <w:rPr>
+                <w:rFonts w:ascii="Arial" w:cs="Arial" w:eastAsia="Arial" w:hAnsi="Arial"/>
+                <w:sz w:val="22"/>
+                <w:szCs w:val="22"/>
+              </w:rPr>
+              <w:t xml:space="preserve">Nome: </w:t>
+            </w:r>
+            <w:r>
+              <w:rPr>
+                <w:rFonts w:ascii="Arial" w:cs="Arial" w:eastAsia="Arial" w:hAnsi="Arial"/>
+                <w:sz w:val="22"/>
+                <w:szCs w:val="22"/>
+              </w:rPr>
+              <w:t xml:space="preserve">{cliente.nome_completo}</w:t>
+            </w:r>
+          </w:p>
+        </w:tc>
+        <w:tc>
+          <w:tcPr>
+            <w:tcW w:type="dxa" w:w="2838"/>
+            <w:tcBorders>
+              <w:top w:val="single" w:color="000000" w:sz="4"/>
+              <w:left w:val="single" w:color="000000" w:sz="4"/>
+              <w:bottom w:val="single" w:color="000000" w:sz="4"/>
+              <w:right w:val="single" w:color="000000" w:sz="4"/>
+            </w:tcBorders>
+          </w:tcPr>
+          <w:p>
+            <w:pPr>
+              <w:spacing w:after="40" w:before="40" w:line="276" w:lineRule="auto"/>
+              <w:jc w:val="left"/>
+            </w:pPr>
+            <w:r>
+              <w:rPr>
+                <w:rFonts w:ascii="Arial" w:cs="Arial" w:eastAsia="Arial" w:hAnsi="Arial"/>
+                <w:sz w:val="22"/>
+                <w:szCs w:val="22"/>
+              </w:rPr>
+              <w:t xml:space="preserve">CPF: </w:t>
+            </w:r>
+            <w:r>
+              <w:rPr>
+                <w:rFonts w:ascii="Arial" w:cs="Arial" w:eastAsia="Arial" w:hAnsi="Arial"/>
+                <w:sz w:val="22"/>
+                <w:szCs w:val="22"/>
+              </w:rPr>
+              <w:t xml:space="preserve">{cliente.cpf}</w:t>
             </w:r>
           </w:p>
         </w:tc>
@@ -642,54 +739,42 @@
     </w:tbl>
     <w:p>
       <w:pPr>
-        <w:spacing w:after="80" w:before="240" w:line="276" w:lineRule="auto"/>
-        <w:jc w:val="both"/>
+        <w:spacing w:after="320" w:before="240" w:line="276" w:lineRule="auto"/>
+        <w:jc w:val="left"/>
+      </w:pPr>
+      <w:r>
+        <w:rPr>
+          <w:rFonts w:ascii="Arial" w:cs="Arial" w:eastAsia="Arial" w:hAnsi="Arial"/>
+          <w:sz w:val="22"/>
+          <w:szCs w:val="22"/>
+        </w:rPr>
+        <w:t xml:space="preserve">{doc.cidade_assinatura}, {doc.dia_assinatura} de {doc.mes_assinatura_extenso} de {doc.ano_assinatura}.</w:t>
+      </w:r>
+    </w:p>
+    <w:p>
+      <w:pPr>
+        <w:spacing w:after="0" w:before="0" w:line="276" w:lineRule="auto"/>
+        <w:jc w:val="left"/>
+      </w:pPr>
+      <w:r>
+        <w:rPr>
+          <w:rFonts w:ascii="Arial" w:cs="Arial" w:eastAsia="Arial" w:hAnsi="Arial"/>
+          <w:sz w:val="22"/>
+          <w:szCs w:val="22"/>
+        </w:rPr>
+        <w:t xml:space="preserve">_________________________________</w:t>
+      </w:r>
+    </w:p>
+    <w:p>
+      <w:pPr>
+        <w:spacing w:after="0" w:before="0" w:line="276" w:lineRule="auto"/>
+        <w:jc w:val="left"/>
       </w:pPr>
       <w:r>
         <w:rPr>
           <w:rFonts w:ascii="Arial" w:cs="Arial" w:eastAsia="Arial" w:hAnsi="Arial"/>
           <w:b/>
           <w:bCs/>
-          <w:sz w:val="22"/>
-          <w:szCs w:val="22"/>
-        </w:rPr>
-        <w:t xml:space="preserve">Local e Data: </w:t>
-      </w:r>
-      <w:r>
-        <w:rPr>
-          <w:rFonts w:ascii="Arial" w:cs="Arial" w:eastAsia="Arial" w:hAnsi="Arial"/>
-          <w:sz w:val="22"/>
-          <w:szCs w:val="22"/>
-        </w:rPr>
-        <w:t xml:space="preserve">{doc.cidade_assinatura}, </w:t>
-      </w:r>
-      <w:r>
-        <w:rPr>
-          <w:rFonts w:ascii="Arial" w:cs="Arial" w:eastAsia="Arial" w:hAnsi="Arial"/>
-          <w:sz w:val="22"/>
-          <w:szCs w:val="22"/>
-        </w:rPr>
-        <w:t xml:space="preserve">{doc.dia_assinatura}/{doc.mes_assinatura_numero}/{doc.ano_assinatura}</w:t>
-      </w:r>
-    </w:p>
-    <w:p>
-      <w:pPr>
-        <w:spacing w:after="0" w:before="80" w:line="276" w:lineRule="auto"/>
-        <w:jc w:val="left"/>
-      </w:pPr>
-      <w:r>
-        <w:rPr>
-          <w:rFonts w:ascii="Arial" w:cs="Arial" w:eastAsia="Arial" w:hAnsi="Arial"/>
-          <w:b/>
-          <w:bCs/>
-          <w:sz w:val="22"/>
-          <w:szCs w:val="22"/>
-        </w:rPr>
-        <w:t xml:space="preserve">Assinatura: </w:t>
-      </w:r>
-      <w:r>
-        <w:rPr>
-          <w:rFonts w:ascii="Arial" w:cs="Arial" w:eastAsia="Arial" w:hAnsi="Arial"/>
           <w:sz w:val="22"/>
           <w:szCs w:val="22"/>
         </w:rPr>

</xml_diff>

<commit_message>
fix: Termo de Responsabilidade — assinatura com cliente menor + mãe em negrito
- Após a linha de assinatura: nome e CPF do cliente em fonte menor (9pt)
  seguidos diretamente pelo nome e CPF da mãe em negrito, sem espaço entre linhas

Co-Authored-By: Claude Sonnet 4.6 <noreply@anthropic.com>
</commit_message>
<xml_diff>
--- a/templates/15_termo_responsabilidade.docx
+++ b/templates/15_termo_responsabilidade.docx
@@ -773,12 +773,56 @@
       <w:r>
         <w:rPr>
           <w:rFonts w:ascii="Arial" w:cs="Arial" w:eastAsia="Arial" w:hAnsi="Arial"/>
+          <w:sz w:val="18"/>
+          <w:szCs w:val="18"/>
+        </w:rPr>
+        <w:t xml:space="preserve">{cliente.nome_completo}</w:t>
+      </w:r>
+    </w:p>
+    <w:p>
+      <w:pPr>
+        <w:spacing w:after="0" w:before="0" w:line="276" w:lineRule="auto"/>
+        <w:jc w:val="left"/>
+      </w:pPr>
+      <w:r>
+        <w:rPr>
+          <w:rFonts w:ascii="Arial" w:cs="Arial" w:eastAsia="Arial" w:hAnsi="Arial"/>
+          <w:sz w:val="18"/>
+          <w:szCs w:val="18"/>
+        </w:rPr>
+        <w:t xml:space="preserve">{cliente.cpf}</w:t>
+      </w:r>
+    </w:p>
+    <w:p>
+      <w:pPr>
+        <w:spacing w:after="0" w:before="0" w:line="276" w:lineRule="auto"/>
+        <w:jc w:val="left"/>
+      </w:pPr>
+      <w:r>
+        <w:rPr>
+          <w:rFonts w:ascii="Arial" w:cs="Arial" w:eastAsia="Arial" w:hAnsi="Arial"/>
           <w:b/>
           <w:bCs/>
           <w:sz w:val="22"/>
           <w:szCs w:val="22"/>
         </w:rPr>
         <w:t xml:space="preserve">{representacao_legal.representante_nome}</w:t>
+      </w:r>
+    </w:p>
+    <w:p>
+      <w:pPr>
+        <w:spacing w:after="0" w:before="0" w:line="276" w:lineRule="auto"/>
+        <w:jc w:val="left"/>
+      </w:pPr>
+      <w:r>
+        <w:rPr>
+          <w:rFonts w:ascii="Arial" w:cs="Arial" w:eastAsia="Arial" w:hAnsi="Arial"/>
+          <w:b/>
+          <w:bCs/>
+          <w:sz w:val="22"/>
+          <w:szCs w:val="22"/>
+        </w:rPr>
+        <w:t xml:space="preserve">{representacao_legal.representante_cpf}</w:t>
       </w:r>
     </w:p>
     <w:sectPr>

</xml_diff>